<commit_message>
Polish ELP export layout and keep in-album photo order.
Persist photo_file_order, slim empty ELP photo slots, refresh TOC via Word, and cache embed JPEGs so export stays fast. Version stays 1.4.0.

Co-authored-by: Cursor <cursoragent@cursor.com>
</commit_message>
<xml_diff>
--- a/templates/report_templates/template_en.docx
+++ b/templates/report_templates/template_en.docx
@@ -110,13 +110,47 @@
       </w:r>
     </w:p>
     <w:p>
+      <w:r>
+        <w:t>Test Item</w:t>
+      </w:r>
+      <w:r>
+        <w:t>：</w:t>
+      </w:r>
+      <w:r>
+        <w:rPr>
+          <w:bCs/>
+        </w:rPr>
+        <w:t>Please refer to the following pages</w:t>
+      </w:r>
+    </w:p>
+    <w:p>
+      <w:r>
+        <w:rPr>
+          <w:bCs/>
+        </w:rPr>
+        <w:t>Test Method</w:t>
+      </w:r>
+      <w:r>
+        <w:t>：</w:t>
+      </w:r>
+      <w:r>
+        <w:rPr>
+          <w:bCs/>
+        </w:rPr>
+        <w:t>Please refer to the following pages</w:t>
+      </w:r>
+    </w:p>
+    <w:p>
       <w:pPr>
         <w:rPr>
-          <w:rFonts w:hint="eastAsia"/>
+          <w:bCs/>
         </w:rPr>
       </w:pPr>
       <w:r>
-        <w:t>Test Item</w:t>
+        <w:rPr>
+          <w:bCs/>
+        </w:rPr>
+        <w:t>Test Result</w:t>
       </w:r>
       <w:r>
         <w:t>：</w:t>
@@ -131,68 +165,18 @@
     <w:p>
       <w:pPr>
         <w:rPr>
-          <w:rFonts w:hint="eastAsia"/>
+          <w:bCs/>
         </w:rPr>
       </w:pPr>
-      <w:r>
+    </w:p>
+    <w:p>
+      <w:pPr>
         <w:rPr>
           <w:bCs/>
         </w:rPr>
-        <w:t>Test Method</w:t>
-      </w:r>
-      <w:r>
-        <w:t>：</w:t>
-      </w:r>
-      <w:r>
-        <w:rPr>
-          <w:bCs/>
-        </w:rPr>
-        <w:t>Please refer to the following pages</w:t>
-      </w:r>
-    </w:p>
-    <w:p>
-      <w:pPr>
-        <w:rPr>
-          <w:bCs/>
-        </w:rPr>
       </w:pPr>
-      <w:r>
-        <w:rPr>
-          <w:bCs/>
-        </w:rPr>
-        <w:t>Test Result</w:t>
-      </w:r>
-      <w:r>
-        <w:t>：</w:t>
-      </w:r>
-      <w:r>
-        <w:rPr>
-          <w:bCs/>
-        </w:rPr>
-        <w:t>Please refer to the following pages</w:t>
-      </w:r>
-    </w:p>
-    <w:p>
-      <w:pPr>
-        <w:rPr>
-          <w:bCs/>
-        </w:rPr>
-      </w:pPr>
-    </w:p>
-    <w:p>
-      <w:pPr>
-        <w:rPr>
-          <w:bCs/>
-        </w:rPr>
-      </w:pPr>
-    </w:p>
-    <w:p>
-      <w:pPr>
-        <w:rPr>
-          <w:rFonts w:hint="eastAsia"/>
-        </w:rPr>
-      </w:pPr>
-    </w:p>
+    </w:p>
+    <w:p/>
     <w:tbl>
       <w:tblPr>
         <w:tblW w:w="8802" w:type="dxa"/>
@@ -554,7 +538,23 @@
           <w:sz w:val="18"/>
           <w:szCs w:val="18"/>
         </w:rPr>
-        <w:t>{{实验室地址_en}}</w:t>
+        <w:t>{{</w:t>
+      </w:r>
+      <w:r>
+        <w:rPr>
+          <w:kern w:val="0"/>
+          <w:sz w:val="18"/>
+          <w:szCs w:val="18"/>
+        </w:rPr>
+        <w:t>实验室地址</w:t>
+      </w:r>
+      <w:r>
+        <w:rPr>
+          <w:kern w:val="0"/>
+          <w:sz w:val="18"/>
+          <w:szCs w:val="18"/>
+        </w:rPr>
+        <w:t>_en}}</w:t>
       </w:r>
     </w:p>
     <w:p/>
@@ -579,7 +579,6 @@
       <w:pPr>
         <w:jc w:val="center"/>
         <w:rPr>
-          <w:rFonts w:hint="eastAsia"/>
           <w:bCs/>
           <w:sz w:val="36"/>
           <w:szCs w:val="36"/>
@@ -621,7 +620,6 @@
       <w:pPr>
         <w:jc w:val="center"/>
         <w:rPr>
-          <w:rFonts w:hint="eastAsia"/>
           <w:sz w:val="36"/>
           <w:szCs w:val="36"/>
         </w:rPr>
@@ -778,30 +776,50 @@
     <w:p/>
     <w:p>
       <w:r>
-        <w:t>Note</w:t>
+        <w:t>Note: Indicates the item(s)/method(s) is (are) not in CMA accreditation scope, the testing data and result is just for scientific research, education, internal quality control and product development etc.</w:t>
+      </w:r>
+    </w:p>
+    <w:p/>
+    <w:p/>
+    <w:p>
+      <w:r>
+        <w:t xml:space="preserve">Statement: </w:t>
+      </w:r>
+    </w:p>
+    <w:p>
+      <w:r>
+        <w:t>1.The test report is effective only with both signature and inspection &amp; Testing service stamp.</w:t>
+      </w:r>
+    </w:p>
+    <w:p>
+      <w:r>
+        <w:t>2.The result(s) shown in this report refer only to the sample(s) tested. The laboratory has not been</w:t>
       </w:r>
       <w:r>
         <w:rPr>
           <w:rFonts w:hint="eastAsia"/>
         </w:rPr>
-        <w:t>：</w:t>
-      </w:r>
-      <w:r>
-        <w:t>Indicates the item(s)/method(s) is (are) not in CMA accreditation scope, the testing data and result is just for scientific research, education, internal quality control and product development etc.</w:t>
-      </w:r>
-    </w:p>
-    <w:p/>
-    <w:p>
-      <w:r>
-        <w:t>The test report is effective only with both signature and Inspection &amp; Testing Service stamp. The result(s) shown in this report refer only to the sample(s) tested. The laboratory has not been responsible for the sampling stage, the result apply to the sample as received. Without written approval of CTI, this report can’t be reproduced except in full.</w:t>
-      </w:r>
-    </w:p>
-    <w:p>
-      <w:r>
-        <w:t>An electronic report without the signature of the ' CENTRE TESTING INTERNATIONAL ' digital certificate is considered invalid.</w:t>
-      </w:r>
-    </w:p>
-    <w:p/>
+        <w:t xml:space="preserve"> </w:t>
+      </w:r>
+      <w:r>
+        <w:t>responsible for the sampling stage, the result apply to the sample as received.</w:t>
+      </w:r>
+    </w:p>
+    <w:p>
+      <w:r>
+        <w:t>3.Without written approval of CTI, this report can’t be reproduced except in full.</w:t>
+      </w:r>
+    </w:p>
+    <w:p>
+      <w:r>
+        <w:t>4.An electronic report without the signature of the ' CENTRE TESTING INTERNATIONAL' digital certificate is considered invalid.</w:t>
+      </w:r>
+    </w:p>
+    <w:p>
+      <w:r>
+        <w:t>5.Unless otherwise specified, the report adopts the decision rule based on simple acceptance for conformity assessment (w=0) in accordance with CNAS-GL015.</w:t>
+      </w:r>
+    </w:p>
     <w:p>
       <w:pPr>
         <w:jc w:val="center"/>
@@ -887,7 +905,7 @@
         <w:sz w:val="21"/>
         <w:szCs w:val="21"/>
       </w:rPr>
-      <w:pict w14:anchorId="5AD3F94A">
+      <w:pict w14:anchorId="4C2325A7">
         <v:shapetype id="_x0000_t75" coordsize="21600,21600" o:spt="75" o:preferrelative="t" path="m@4@5l@4@11@9@11@9@5xe" filled="f" stroked="f">
           <v:stroke joinstyle="miter"/>
           <v:formulas>
@@ -945,36 +963,6 @@
               <w:szCs w:val="28"/>
             </w:rPr>
           </w:pPr>
-          <w:r>
-            <w:rPr>
-              <w:b/>
-            </w:rPr>
-            <w:pict w14:anchorId="4370EDEC">
-              <v:shapetype id="_x0000_t75" coordsize="21600,21600" o:spt="75" o:preferrelative="t" path="m@4@5l@4@11@9@11@9@5xe" filled="f" stroked="f">
-                <v:stroke joinstyle="miter"/>
-                <v:formulas>
-                  <v:f eqn="if lineDrawn pixelLineWidth 0"/>
-                  <v:f eqn="sum @0 1 0"/>
-                  <v:f eqn="sum 0 0 @1"/>
-                  <v:f eqn="prod @2 1 2"/>
-                  <v:f eqn="prod @3 21600 pixelWidth"/>
-                  <v:f eqn="prod @3 21600 pixelHeight"/>
-                  <v:f eqn="sum @0 0 1"/>
-                  <v:f eqn="prod @6 1 2"/>
-                  <v:f eqn="prod @7 21600 pixelWidth"/>
-                  <v:f eqn="sum @8 21600 0"/>
-                  <v:f eqn="prod @7 21600 pixelHeight"/>
-                  <v:f eqn="sum @10 21600 0"/>
-                </v:formulas>
-                <v:path o:extrusionok="f" gradientshapeok="t" o:connecttype="rect"/>
-                <o:lock v:ext="edit" aspectratio="t"/>
-              </v:shapetype>
-              <v:shape id="WordPictureWatermark769220720" o:spid="_x0000_s1026" type="#_x0000_t75" alt="" style="position:absolute;left:0;text-align:left;margin-left:-90.55pt;margin-top:-79.1pt;width:596.35pt;height:843.1pt;z-index:-251655168;mso-wrap-edited:f;mso-width-percent:0;mso-height-percent:0;mso-position-horizontal-relative:margin;mso-position-vertical-relative:margin;mso-width-percent:0;mso-height-percent:0;mso-width-relative:page;mso-height-relative:page" o:allowincell="f">
-                <v:imagedata r:id="rId1" o:title="CTI背景~~"/>
-                <w10:wrap anchorx="margin" anchory="margin"/>
-              </v:shape>
-            </w:pict>
-          </w:r>
         </w:p>
       </w:tc>
     </w:tr>
@@ -989,7 +977,6 @@
           <w:pPr>
             <w:jc w:val="center"/>
             <w:rPr>
-              <w:rFonts w:hint="eastAsia"/>
               <w:b/>
               <w:sz w:val="52"/>
               <w:szCs w:val="52"/>
@@ -1049,9 +1036,6 @@
           <w:pPr>
             <w:wordWrap w:val="0"/>
             <w:jc w:val="right"/>
-            <w:rPr>
-              <w:rFonts w:hint="eastAsia"/>
-            </w:rPr>
           </w:pPr>
           <w:r>
             <w:rPr>
@@ -1117,10 +1101,39 @@
   <w:p>
     <w:pPr>
       <w:rPr>
-        <w:rFonts w:hint="eastAsia"/>
         <w:b/>
       </w:rPr>
     </w:pPr>
+    <w:r>
+      <w:rPr>
+        <w:b/>
+      </w:rPr>
+      <w:pict w14:anchorId="659EE3D1">
+        <v:shapetype id="_x0000_t75" coordsize="21600,21600" o:spt="75" o:preferrelative="t" path="m@4@5l@4@11@9@11@9@5xe" filled="f" stroked="f">
+          <v:stroke joinstyle="miter"/>
+          <v:formulas>
+            <v:f eqn="if lineDrawn pixelLineWidth 0"/>
+            <v:f eqn="sum @0 1 0"/>
+            <v:f eqn="sum 0 0 @1"/>
+            <v:f eqn="prod @2 1 2"/>
+            <v:f eqn="prod @3 21600 pixelWidth"/>
+            <v:f eqn="prod @3 21600 pixelHeight"/>
+            <v:f eqn="sum @0 0 1"/>
+            <v:f eqn="prod @6 1 2"/>
+            <v:f eqn="prod @7 21600 pixelWidth"/>
+            <v:f eqn="sum @8 21600 0"/>
+            <v:f eqn="prod @7 21600 pixelHeight"/>
+            <v:f eqn="sum @10 21600 0"/>
+          </v:formulas>
+          <v:path o:extrusionok="f" gradientshapeok="t" o:connecttype="rect"/>
+          <o:lock v:ext="edit" aspectratio="t"/>
+        </v:shapetype>
+        <v:shape id="WordPictureWatermark769220720" o:spid="_x0000_s1026" type="#_x0000_t75" alt="" style="position:absolute;left:0;text-align:left;margin-left:-90.55pt;margin-top:-79.1pt;width:596.35pt;height:843.1pt;z-index:-251655168;mso-wrap-edited:f;mso-width-percent:0;mso-height-percent:0;mso-position-horizontal-relative:margin;mso-position-vertical-relative:margin;mso-width-percent:0;mso-height-percent:0;mso-width-relative:page;mso-height-relative:page" o:allowincell="f">
+          <v:imagedata r:id="rId1" o:title="CTI背景~~"/>
+          <w10:wrap anchorx="margin" anchory="margin"/>
+        </v:shape>
+      </w:pict>
+    </w:r>
   </w:p>
 </w:hdr>
 </file>
@@ -1136,7 +1149,7 @@
         <w:sz w:val="21"/>
         <w:szCs w:val="21"/>
       </w:rPr>
-      <w:pict w14:anchorId="1E403DC2">
+      <w:pict w14:anchorId="5BA3A5D4">
         <v:shapetype id="_x0000_t75" coordsize="21600,21600" o:spt="75" o:preferrelative="t" path="m@4@5l@4@11@9@11@9@5xe" filled="f" stroked="f">
           <v:stroke joinstyle="miter"/>
           <v:formulas>

</xml_diff>